<commit_message>
Documentação: registra a página publicada no GitHub Pages
Co-Authored-By: Claude Opus 5.5 <noreply@anthropic.com>
</commit_message>
<xml_diff>
--- a/documentacao/iAgro_Territorial_metodo_e_objetivo.docx
+++ b/documentacao/iAgro_Territorial_metodo_e_objetivo.docx
@@ -427,7 +427,55 @@
         <w:pStyle w:val="Heading2"/>
       </w:pPr>
       <w:r>
-        <w:t>4.3 Agente</w:t>
+        <w:t>4.3 Página de busca online (GitHub Pages)</w:t>
+      </w:r>
+    </w:p>
+    <w:p>
+      <w:pPr>
+        <w:pStyle w:val="ListBullet"/>
+      </w:pPr>
+      <w:r>
+        <w:t>Endereço: https://danimaciel.github.io/iagro/ (código em https://github.com/danimaciel/iagro).</w:t>
+      </w:r>
+    </w:p>
+    <w:p>
+      <w:pPr>
+        <w:pStyle w:val="ListBullet"/>
+      </w:pPr>
+      <w:r>
+        <w:t>Página estática: os documentos e os vetores (int8) vão junto com a página; a pergunta é transformada em vetor no próprio navegador (transformers.js, multilingual-e5-base quantizado, cerca de 110 MB na primeira visita) e combinada com busca por palavras (BM25) pela mesma fusão por posição. Nenhuma pergunta vai para servidor; custo zero.</w:t>
+      </w:r>
+    </w:p>
+    <w:p>
+      <w:pPr>
+        <w:pStyle w:val="ListBullet"/>
+      </w:pPr>
+      <w:r>
+        <w:t>Mostra os documentos mais próximos com tipo, ano, resumo e link para o Portal Embrapa. Quando a semelhança do primeiro resultado é baixa, avisa que talvez a Territorial não tenha trabalho sobre o assunto.</w:t>
+      </w:r>
+    </w:p>
+    <w:p>
+      <w:pPr>
+        <w:pStyle w:val="ListBullet"/>
+      </w:pPr>
+      <w:r>
+        <w:t>Teste com o gabarito na página publicada localmente: documento esperado em 1º lugar em 21 de 23 perguntas com resposta (2º lugar nas outras duas); aviso de relação fraca em 6 das 7 perguntas fora do tema e em nenhuma das 23.</w:t>
+      </w:r>
+    </w:p>
+    <w:p>
+      <w:pPr>
+        <w:pStyle w:val="ListBullet"/>
+      </w:pPr>
+      <w:r>
+        <w:t>Atualizar: rodar agente/preparar_base.py e site/preparar_site.py e enviar ao GitHub; a publicação é automática.</w:t>
+      </w:r>
+    </w:p>
+    <w:p>
+      <w:pPr>
+        <w:pStyle w:val="Heading2"/>
+      </w:pPr>
+      <w:r>
+        <w:t>4.4 Agente</w:t>
       </w:r>
     </w:p>
     <w:p>
@@ -1452,6 +1500,36 @@
           </w:p>
         </w:tc>
       </w:tr>
+      <w:tr>
+        <w:tc>
+          <w:tcPr>
+            <w:tcW w:type="dxa" w:w="1474"/>
+          </w:tcPr>
+          <w:p>
+            <w:r/>
+            <w:r>
+              <w:rPr>
+                <w:sz w:val="20"/>
+              </w:rPr>
+              <w:t>05/10/2026</w:t>
+            </w:r>
+          </w:p>
+        </w:tc>
+        <w:tc>
+          <w:tcPr>
+            <w:tcW w:type="dxa" w:w="7597"/>
+          </w:tcPr>
+          <w:p>
+            <w:r/>
+            <w:r>
+              <w:rPr>
+                <w:sz w:val="20"/>
+              </w:rPr>
+              <w:t>Versão online: página estática de busca por significado no GitHub Pages (https://danimaciel.github.io/iagro/), sem modelo generativo; tudo roda no navegador. Liberada porque todo o conjunto é público. Propósito: demonstrar como bases como a BDPA e a Infoteca podem ser reposicionadas; a página diz que não é serviço oficial da Embrapa.</w:t>
+            </w:r>
+          </w:p>
+        </w:tc>
+      </w:tr>
     </w:tbl>
     <w:p/>
     <w:sectPr>

</xml_diff>

<commit_message>
Documentação: resultado da avaliação do agente (Qwen 2.5 7B)
Co-Authored-By: Claude Opus 5.5 <noreply@anthropic.com>
</commit_message>
<xml_diff>
--- a/documentacao/iAgro_Territorial_metodo_e_objetivo.docx
+++ b/documentacao/iAgro_Territorial_metodo_e_objetivo.docx
@@ -747,6 +747,450 @@
           <w:i w:val="0"/>
         </w:rPr>
         <w:t>Na primeira rodada, várias "falhas" eram documentos certos que o gabarito não listava (por exemplo, publicações sobre o MonitoraOeste e o Atlas Escolar). Eles foram conferidos e acrescentados ao gabarito.</w:t>
+      </w:r>
+    </w:p>
+    <w:p>
+      <w:pPr>
+        <w:pStyle w:val="Heading2"/>
+      </w:pPr>
+      <w:r>
+        <w:t>6.2 Agente: qwen2.5_7b</w:t>
+      </w:r>
+    </w:p>
+    <w:tbl>
+      <w:tblPr>
+        <w:tblStyle w:val="TableGrid"/>
+        <w:tblW w:type="auto" w:w="0"/>
+        <w:jc w:val="center"/>
+        <w:tblLook w:firstColumn="1" w:firstRow="1" w:lastColumn="0" w:lastRow="0" w:noHBand="0" w:noVBand="1" w:val="04A0"/>
+      </w:tblPr>
+      <w:tblGrid>
+        <w:gridCol w:w="1296"/>
+        <w:gridCol w:w="1296"/>
+        <w:gridCol w:w="1296"/>
+        <w:gridCol w:w="1296"/>
+        <w:gridCol w:w="1296"/>
+        <w:gridCol w:w="1296"/>
+        <w:gridCol w:w="1296"/>
+      </w:tblGrid>
+      <w:tr>
+        <w:tc>
+          <w:tcPr>
+            <w:tcW w:type="dxa" w:w="1701"/>
+            <w:shd w:val="clear" w:color="auto" w:fill="DCE9DD"/>
+          </w:tcPr>
+          <w:p>
+            <w:r/>
+            <w:r>
+              <w:rPr>
+                <w:b/>
+                <w:sz w:val="20"/>
+              </w:rPr>
+              <w:t>Grupo</w:t>
+            </w:r>
+          </w:p>
+        </w:tc>
+        <w:tc>
+          <w:tcPr>
+            <w:tcW w:type="dxa" w:w="1228"/>
+            <w:shd w:val="clear" w:color="auto" w:fill="DCE9DD"/>
+          </w:tcPr>
+          <w:p>
+            <w:r/>
+            <w:r>
+              <w:rPr>
+                <w:b/>
+                <w:sz w:val="20"/>
+              </w:rPr>
+              <w:t>Perguntas</w:t>
+            </w:r>
+          </w:p>
+        </w:tc>
+        <w:tc>
+          <w:tcPr>
+            <w:tcW w:type="dxa" w:w="1228"/>
+            <w:shd w:val="clear" w:color="auto" w:fill="DCE9DD"/>
+          </w:tcPr>
+          <w:p>
+            <w:r/>
+            <w:r>
+              <w:rPr>
+                <w:b/>
+                <w:sz w:val="20"/>
+              </w:rPr>
+              <w:t>Busca trouxe um documento esperado</w:t>
+            </w:r>
+          </w:p>
+        </w:tc>
+        <w:tc>
+          <w:tcPr>
+            <w:tcW w:type="dxa" w:w="1228"/>
+            <w:shd w:val="clear" w:color="auto" w:fill="DCE9DD"/>
+          </w:tcPr>
+          <w:p>
+            <w:r/>
+            <w:r>
+              <w:rPr>
+                <w:b/>
+                <w:sz w:val="20"/>
+              </w:rPr>
+              <w:t>Citou um documento esperado</w:t>
+            </w:r>
+          </w:p>
+        </w:tc>
+        <w:tc>
+          <w:tcPr>
+            <w:tcW w:type="dxa" w:w="1228"/>
+            <w:shd w:val="clear" w:color="auto" w:fill="DCE9DD"/>
+          </w:tcPr>
+          <w:p>
+            <w:r/>
+            <w:r>
+              <w:rPr>
+                <w:b/>
+                <w:sz w:val="20"/>
+              </w:rPr>
+              <w:t>Disse que não encontrou</w:t>
+            </w:r>
+          </w:p>
+        </w:tc>
+        <w:tc>
+          <w:tcPr>
+            <w:tcW w:type="dxa" w:w="1228"/>
+            <w:shd w:val="clear" w:color="auto" w:fill="DCE9DD"/>
+          </w:tcPr>
+          <w:p>
+            <w:r/>
+            <w:r>
+              <w:rPr>
+                <w:b/>
+                <w:sz w:val="20"/>
+              </w:rPr>
+              <w:t>Respondeu mesmo assim (conferir se inventou)</w:t>
+            </w:r>
+          </w:p>
+        </w:tc>
+        <w:tc>
+          <w:tcPr>
+            <w:tcW w:type="dxa" w:w="1228"/>
+            <w:shd w:val="clear" w:color="auto" w:fill="DCE9DD"/>
+          </w:tcPr>
+          <w:p>
+            <w:r/>
+            <w:r>
+              <w:rPr>
+                <w:b/>
+                <w:sz w:val="20"/>
+              </w:rPr>
+              <w:t>Tempo médio (s)</w:t>
+            </w:r>
+          </w:p>
+        </w:tc>
+      </w:tr>
+      <w:tr>
+        <w:tc>
+          <w:tcPr>
+            <w:tcW w:type="dxa" w:w="1701"/>
+          </w:tcPr>
+          <w:p>
+            <w:r/>
+            <w:r>
+              <w:rPr>
+                <w:sz w:val="20"/>
+              </w:rPr>
+              <w:t>Base responde</w:t>
+            </w:r>
+          </w:p>
+        </w:tc>
+        <w:tc>
+          <w:tcPr>
+            <w:tcW w:type="dxa" w:w="1228"/>
+          </w:tcPr>
+          <w:p>
+            <w:r/>
+            <w:r>
+              <w:rPr>
+                <w:sz w:val="20"/>
+              </w:rPr>
+              <w:t>20</w:t>
+            </w:r>
+          </w:p>
+        </w:tc>
+        <w:tc>
+          <w:tcPr>
+            <w:tcW w:type="dxa" w:w="1228"/>
+          </w:tcPr>
+          <w:p>
+            <w:r/>
+            <w:r>
+              <w:rPr>
+                <w:sz w:val="20"/>
+              </w:rPr>
+              <w:t>20.0</w:t>
+            </w:r>
+          </w:p>
+        </w:tc>
+        <w:tc>
+          <w:tcPr>
+            <w:tcW w:type="dxa" w:w="1228"/>
+          </w:tcPr>
+          <w:p>
+            <w:r/>
+            <w:r>
+              <w:rPr>
+                <w:sz w:val="20"/>
+              </w:rPr>
+              <w:t>19.0</w:t>
+            </w:r>
+          </w:p>
+        </w:tc>
+        <w:tc>
+          <w:tcPr>
+            <w:tcW w:type="dxa" w:w="1228"/>
+          </w:tcPr>
+          <w:p>
+            <w:r/>
+            <w:r>
+              <w:rPr>
+                <w:sz w:val="20"/>
+              </w:rPr>
+              <w:t>1</w:t>
+            </w:r>
+          </w:p>
+        </w:tc>
+        <w:tc>
+          <w:tcPr>
+            <w:tcW w:type="dxa" w:w="1228"/>
+          </w:tcPr>
+          <w:p>
+            <w:r/>
+            <w:r>
+              <w:rPr>
+                <w:sz w:val="20"/>
+              </w:rPr>
+            </w:r>
+          </w:p>
+        </w:tc>
+        <w:tc>
+          <w:tcPr>
+            <w:tcW w:type="dxa" w:w="1228"/>
+          </w:tcPr>
+          <w:p>
+            <w:r/>
+            <w:r>
+              <w:rPr>
+                <w:sz w:val="20"/>
+              </w:rPr>
+              <w:t>167.5</w:t>
+            </w:r>
+          </w:p>
+        </w:tc>
+      </w:tr>
+      <w:tr>
+        <w:tc>
+          <w:tcPr>
+            <w:tcW w:type="dxa" w:w="1701"/>
+          </w:tcPr>
+          <w:p>
+            <w:r/>
+            <w:r>
+              <w:rPr>
+                <w:sz w:val="20"/>
+              </w:rPr>
+              <w:t>Base responde em parte</w:t>
+            </w:r>
+          </w:p>
+        </w:tc>
+        <w:tc>
+          <w:tcPr>
+            <w:tcW w:type="dxa" w:w="1228"/>
+          </w:tcPr>
+          <w:p>
+            <w:r/>
+            <w:r>
+              <w:rPr>
+                <w:sz w:val="20"/>
+              </w:rPr>
+              <w:t>3</w:t>
+            </w:r>
+          </w:p>
+        </w:tc>
+        <w:tc>
+          <w:tcPr>
+            <w:tcW w:type="dxa" w:w="1228"/>
+          </w:tcPr>
+          <w:p>
+            <w:r/>
+            <w:r>
+              <w:rPr>
+                <w:sz w:val="20"/>
+              </w:rPr>
+              <w:t>3.0</w:t>
+            </w:r>
+          </w:p>
+        </w:tc>
+        <w:tc>
+          <w:tcPr>
+            <w:tcW w:type="dxa" w:w="1228"/>
+          </w:tcPr>
+          <w:p>
+            <w:r/>
+            <w:r>
+              <w:rPr>
+                <w:sz w:val="20"/>
+              </w:rPr>
+              <w:t>2.0</w:t>
+            </w:r>
+          </w:p>
+        </w:tc>
+        <w:tc>
+          <w:tcPr>
+            <w:tcW w:type="dxa" w:w="1228"/>
+          </w:tcPr>
+          <w:p>
+            <w:r/>
+            <w:r>
+              <w:rPr>
+                <w:sz w:val="20"/>
+              </w:rPr>
+              <w:t>2</w:t>
+            </w:r>
+          </w:p>
+        </w:tc>
+        <w:tc>
+          <w:tcPr>
+            <w:tcW w:type="dxa" w:w="1228"/>
+          </w:tcPr>
+          <w:p>
+            <w:r/>
+            <w:r>
+              <w:rPr>
+                <w:sz w:val="20"/>
+              </w:rPr>
+            </w:r>
+          </w:p>
+        </w:tc>
+        <w:tc>
+          <w:tcPr>
+            <w:tcW w:type="dxa" w:w="1228"/>
+          </w:tcPr>
+          <w:p>
+            <w:r/>
+            <w:r>
+              <w:rPr>
+                <w:sz w:val="20"/>
+              </w:rPr>
+              <w:t>189.1</w:t>
+            </w:r>
+          </w:p>
+        </w:tc>
+      </w:tr>
+      <w:tr>
+        <w:tc>
+          <w:tcPr>
+            <w:tcW w:type="dxa" w:w="1701"/>
+          </w:tcPr>
+          <w:p>
+            <w:r/>
+            <w:r>
+              <w:rPr>
+                <w:sz w:val="20"/>
+              </w:rPr>
+              <w:t>Base não responde</w:t>
+            </w:r>
+          </w:p>
+        </w:tc>
+        <w:tc>
+          <w:tcPr>
+            <w:tcW w:type="dxa" w:w="1228"/>
+          </w:tcPr>
+          <w:p>
+            <w:r/>
+            <w:r>
+              <w:rPr>
+                <w:sz w:val="20"/>
+              </w:rPr>
+              <w:t>7</w:t>
+            </w:r>
+          </w:p>
+        </w:tc>
+        <w:tc>
+          <w:tcPr>
+            <w:tcW w:type="dxa" w:w="1228"/>
+          </w:tcPr>
+          <w:p>
+            <w:r/>
+            <w:r>
+              <w:rPr>
+                <w:sz w:val="20"/>
+              </w:rPr>
+            </w:r>
+          </w:p>
+        </w:tc>
+        <w:tc>
+          <w:tcPr>
+            <w:tcW w:type="dxa" w:w="1228"/>
+          </w:tcPr>
+          <w:p>
+            <w:r/>
+            <w:r>
+              <w:rPr>
+                <w:sz w:val="20"/>
+              </w:rPr>
+            </w:r>
+          </w:p>
+        </w:tc>
+        <w:tc>
+          <w:tcPr>
+            <w:tcW w:type="dxa" w:w="1228"/>
+          </w:tcPr>
+          <w:p>
+            <w:r/>
+            <w:r>
+              <w:rPr>
+                <w:sz w:val="20"/>
+              </w:rPr>
+              <w:t>7</w:t>
+            </w:r>
+          </w:p>
+        </w:tc>
+        <w:tc>
+          <w:tcPr>
+            <w:tcW w:type="dxa" w:w="1228"/>
+          </w:tcPr>
+          <w:p>
+            <w:r/>
+            <w:r>
+              <w:rPr>
+                <w:sz w:val="20"/>
+              </w:rPr>
+              <w:t>0.0</w:t>
+            </w:r>
+          </w:p>
+        </w:tc>
+        <w:tc>
+          <w:tcPr>
+            <w:tcW w:type="dxa" w:w="1228"/>
+          </w:tcPr>
+          <w:p>
+            <w:r/>
+            <w:r>
+              <w:rPr>
+                <w:sz w:val="20"/>
+              </w:rPr>
+              <w:t>129.7</w:t>
+            </w:r>
+          </w:p>
+        </w:tc>
+      </w:tr>
+    </w:tbl>
+    <w:p/>
+    <w:p>
+      <w:r>
+        <w:rPr>
+          <w:i w:val="0"/>
+        </w:rPr>
+        <w:t>Leitura das respostas (05/10/2026): nas 7 perguntas fora do tema o agente disse que não encontrou e não inventou conteúdo. Pontos a corrigir: (1) na pergunta sobre queijo minas sugeriu um link do site da Embrapa Gado de Leite que não veio da base (fere a regra 1); (2) na pergunta sobre custo de recuperação de pastagem respondeu só "não encontrei", quando poderia indicar os trabalhos da Territorial sobre pastagens degradadas (resposta parcial, regra 4). Tempo de 2 a 4 minutos por resposta no processador, sem placa de vídeo.</w:t>
       </w:r>
     </w:p>
     <w:p>

</xml_diff>